<commit_message>
feat: Update checklist questions 6, 7, 11, and 16 with revised content
</commit_message>
<xml_diff>
--- a/本站OSCE效度分析審查.docx
+++ b/本站OSCE效度分析審查.docx
@@ -579,7 +579,7 @@
     </w:p>
     <w:p>
       <w:r>
-        <w:t>正確使用 Ambu bagging 技巧，插管前充分給氧</w:t>
+        <w:t>正確使用 Ambu bagging 技巧，插管前充分給氧至少 88%</w:t>
       </w:r>
     </w:p>
     <w:p>
@@ -614,7 +614,7 @@
     </w:p>
     <w:p>
       <w:r>
-        <w:t>執行壓額抬下巴法打開呼吸道</w:t>
+        <w:t>執行下顎上提法打開呼吸道</w:t>
       </w:r>
     </w:p>
     <w:p>
@@ -754,7 +754,7 @@
     </w:p>
     <w:p>
       <w:r>
-        <w:t>左手拿喉頭鏡且施力方向正確</w:t>
+        <w:t>右手拿喉頭鏡且以牙齒為支點施力方向</w:t>
       </w:r>
     </w:p>
     <w:p>
@@ -929,7 +929,7 @@
     </w:p>
     <w:p>
       <w:r>
-        <w:t>安全丟棄污染物並收拾使用器材</w:t>
+        <w:t>病危患者應請社工協助勸募器官捐贈。</w:t>
       </w:r>
     </w:p>
     <w:p>

</xml_diff>